<commit_message>
Publish approved tuning price list and update workshop documents
</commit_message>
<xml_diff>
--- a/public/dokumenty/obchodni-podminky-autoservis.docx
+++ b/public/dokumenty/obchodni-podminky-autoservis.docx
@@ -7,7 +7,12 @@
         <w:pStyle w:val="Title"/>
       </w:pPr>
       <w:r>
-        <w:t>OBCHODNÍ PODMÍNKY AUTOSERVISU</w:t>
+        <w:rPr>
+          <w:b/>
+          <w:color w:val="272A2F"/>
+          <w:sz w:val="28"/>
+        </w:rPr>
+        <w:t>PGEX  |  OBCHODNÍ PODMÍNKY AUTOSERVISU</w:t>
       </w:r>
     </w:p>
     <w:p>
@@ -20,7 +25,7 @@
     </w:p>
     <w:p>
       <w:r>
-        <w:t>Provozovatel: [JMÉNO A PŘÍJMENÍ / OBCHODNÍ FIRMA], IČO: [IČO], sídlo: [SÍDLO], provozovna: [ADRESA], kontakt: [E-MAIL, TELEFON]. Účinnost od: [DATUM].</w:t>
+        <w:t>PGEX | Provozovatel: Filip Chlanta, IČO: 19628510, sídlo: K Orionce 461/26, 143 00 Praha 4 – Modřany, provozovna: Suchdolská 710, Horoměřice, kontakt: programenvus@gmail.com, +420 731 990 599. Účinnost od: [DATUM].</w:t>
       </w:r>
     </w:p>
     <w:p>
@@ -28,6 +33,9 @@
         <w:pStyle w:val="Heading1"/>
       </w:pPr>
       <w:r>
+        <w:rPr>
+          <w:color w:val="BE8B33"/>
+        </w:rPr>
         <w:t>1. Rozsah a uzavření zakázky</w:t>
       </w:r>
     </w:p>
@@ -41,6 +49,9 @@
         <w:pStyle w:val="Heading1"/>
       </w:pPr>
       <w:r>
+        <w:rPr>
+          <w:color w:val="BE8B33"/>
+        </w:rPr>
         <w:t>2. Předání vozidla</w:t>
       </w:r>
     </w:p>
@@ -54,6 +65,9 @@
         <w:pStyle w:val="Heading1"/>
       </w:pPr>
       <w:r>
+        <w:rPr>
+          <w:color w:val="BE8B33"/>
+        </w:rPr>
         <w:t>3. Diagnostika, cena a vícepráce</w:t>
       </w:r>
     </w:p>
@@ -67,6 +81,9 @@
         <w:pStyle w:val="Heading1"/>
       </w:pPr>
       <w:r>
+        <w:rPr>
+          <w:color w:val="BE8B33"/>
+        </w:rPr>
         <w:t>4. Náhradní díly a materiál</w:t>
       </w:r>
     </w:p>
@@ -80,6 +97,9 @@
         <w:pStyle w:val="Heading1"/>
       </w:pPr>
       <w:r>
+        <w:rPr>
+          <w:color w:val="BE8B33"/>
+        </w:rPr>
         <w:t>5. Termíny a zkušební jízdy</w:t>
       </w:r>
     </w:p>
@@ -93,6 +113,9 @@
         <w:pStyle w:val="Heading1"/>
       </w:pPr>
       <w:r>
+        <w:rPr>
+          <w:color w:val="BE8B33"/>
+        </w:rPr>
         <w:t>6. Dokončení, úhrada a převzetí</w:t>
       </w:r>
     </w:p>
@@ -106,6 +129,9 @@
         <w:pStyle w:val="Heading1"/>
       </w:pPr>
       <w:r>
+        <w:rPr>
+          <w:color w:val="BE8B33"/>
+        </w:rPr>
         <w:t>7. Odstavení dokončeného vozidla (parkovné)</w:t>
       </w:r>
     </w:p>
@@ -119,6 +145,9 @@
         <w:pStyle w:val="Heading1"/>
       </w:pPr>
       <w:r>
+        <w:rPr>
+          <w:color w:val="BE8B33"/>
+        </w:rPr>
         <w:t>8. Reklamace a práva z vad</w:t>
       </w:r>
     </w:p>
@@ -132,6 +161,9 @@
         <w:pStyle w:val="Heading1"/>
       </w:pPr>
       <w:r>
+        <w:rPr>
+          <w:color w:val="BE8B33"/>
+        </w:rPr>
         <w:t>9. Odpovědnost a pojištění</w:t>
       </w:r>
     </w:p>
@@ -145,6 +177,9 @@
         <w:pStyle w:val="Heading1"/>
       </w:pPr>
       <w:r>
+        <w:rPr>
+          <w:color w:val="BE8B33"/>
+        </w:rPr>
         <w:t>10. Osobní údaje</w:t>
       </w:r>
     </w:p>
@@ -158,6 +193,9 @@
         <w:pStyle w:val="Heading1"/>
       </w:pPr>
       <w:r>
+        <w:rPr>
+          <w:color w:val="BE8B33"/>
+        </w:rPr>
         <w:t>11. Mimosoudní řešení sporů</w:t>
       </w:r>
     </w:p>
@@ -171,6 +209,9 @@
         <w:pStyle w:val="Heading1"/>
       </w:pPr>
       <w:r>
+        <w:rPr>
+          <w:color w:val="BE8B33"/>
+        </w:rPr>
         <w:t>12. Závěrečná ustanovení</w:t>
       </w:r>
     </w:p>
@@ -184,6 +225,9 @@
         <w:pStyle w:val="Heading1"/>
       </w:pPr>
       <w:r>
+        <w:rPr>
+          <w:color w:val="BE8B33"/>
+        </w:rPr>
         <w:t>PŘED POUŽITÍM DOPLNIT A ZKONTROLOVAT</w:t>
       </w:r>
     </w:p>
@@ -202,6 +246,9 @@
         <w:pStyle w:val="Heading2"/>
       </w:pPr>
       <w:r>
+        <w:rPr>
+          <w:color w:val="BE8B33"/>
+        </w:rPr>
         <w:t>13. Bonusová péče o vozidlo</w:t>
       </w:r>
     </w:p>
@@ -211,13 +258,84 @@
       </w:r>
     </w:p>
     <w:sectPr>
+      <w:headerReference w:type="default" r:id="rId9"/>
+      <w:footerReference w:type="default" r:id="rId10"/>
       <w:pgSz w:w="12240" w:h="15840"/>
-      <w:pgMar w:top="935" w:right="1077" w:bottom="879" w:left="1077" w:header="720" w:footer="720" w:gutter="0"/>
+      <w:pgMar w:top="935" w:right="1077" w:bottom="879" w:left="1077" w:header="340" w:footer="720" w:gutter="0"/>
       <w:cols w:space="720"/>
       <w:docGrid w:linePitch="360"/>
     </w:sectPr>
   </w:body>
 </w:document>
+</file>
+
+<file path=word/footer1.xml><?xml version="1.0" encoding="utf-8"?>
+<w:ftr xmlns:m="http://schemas.openxmlformats.org/officeDocument/2006/math" xmlns:mc="http://schemas.openxmlformats.org/markup-compatibility/2006" xmlns:mo="http://schemas.microsoft.com/office/mac/office/2008/main" xmlns:mv="urn:schemas-microsoft-com:mac:vml" xmlns:o="urn:schemas-microsoft-com:office:office" xmlns:r="http://schemas.openxmlformats.org/officeDocument/2006/relationships" xmlns:v="urn:schemas-microsoft-com:vml" xmlns:w10="urn:schemas-microsoft-com:office:word" xmlns:w14="http://schemas.microsoft.com/office/word/2010/wordml" xmlns:w="http://schemas.openxmlformats.org/wordprocessingml/2006/main" xmlns:wne="http://schemas.microsoft.com/office/word/2006/wordml" xmlns:wp14="http://schemas.microsoft.com/office/word/2010/wordprocessingDrawing" xmlns:wp="http://schemas.openxmlformats.org/drawingml/2006/wordprocessingDrawing" xmlns:wpc="http://schemas.microsoft.com/office/word/2010/wordprocessingCanvas" xmlns:wpg="http://schemas.microsoft.com/office/word/2010/wordprocessingGroup" xmlns:wpi="http://schemas.microsoft.com/office/word/2010/wordprocessingInk" xmlns:wps="http://schemas.microsoft.com/office/word/2010/wordprocessingShape" mc:Ignorable="w14 wp14">
+  <w:p>
+    <w:pPr>
+      <w:pStyle w:val="Footer"/>
+      <w:jc w:val="center"/>
+    </w:pPr>
+    <w:r>
+      <w:rPr>
+        <w:color w:val="BE8B33"/>
+        <w:sz w:val="16"/>
+      </w:rPr>
+      <w:t>PGEX  •  Autoservis &amp; Pneuservis  |  IČO: 19628510 | Suchdolská 710, Horoměřice</w:t>
+    </w:r>
+  </w:p>
+</w:ftr>
+</file>
+
+<file path=word/header1.xml><?xml version="1.0" encoding="utf-8"?>
+<w:hdr xmlns:m="http://schemas.openxmlformats.org/officeDocument/2006/math" xmlns:mc="http://schemas.openxmlformats.org/markup-compatibility/2006" xmlns:mo="http://schemas.microsoft.com/office/mac/office/2008/main" xmlns:mv="urn:schemas-microsoft-com:mac:vml" xmlns:o="urn:schemas-microsoft-com:office:office" xmlns:r="http://schemas.openxmlformats.org/officeDocument/2006/relationships" xmlns:v="urn:schemas-microsoft-com:vml" xmlns:w10="urn:schemas-microsoft-com:office:word" xmlns:w14="http://schemas.microsoft.com/office/word/2010/wordml" xmlns:w="http://schemas.openxmlformats.org/wordprocessingml/2006/main" xmlns:wne="http://schemas.microsoft.com/office/word/2006/wordml" xmlns:wp14="http://schemas.microsoft.com/office/word/2010/wordprocessingDrawing" xmlns:wp="http://schemas.openxmlformats.org/drawingml/2006/wordprocessingDrawing" xmlns:wpc="http://schemas.microsoft.com/office/word/2010/wordprocessingCanvas" xmlns:wpg="http://schemas.microsoft.com/office/word/2010/wordprocessingGroup" xmlns:wpi="http://schemas.microsoft.com/office/word/2010/wordprocessingInk" xmlns:wps="http://schemas.microsoft.com/office/word/2010/wordprocessingShape" mc:Ignorable="w14 wp14">
+  <w:p>
+    <w:pPr>
+      <w:pStyle w:val="Header"/>
+      <w:jc w:val="right"/>
+    </w:pPr>
+    <w:r>
+      <w:drawing>
+        <wp:inline xmlns:a="http://schemas.openxmlformats.org/drawingml/2006/main" xmlns:pic="http://schemas.openxmlformats.org/drawingml/2006/picture">
+          <wp:extent cx="1475999" cy="282515"/>
+          <wp:docPr id="1" name="Picture 1"/>
+          <wp:cNvGraphicFramePr>
+            <a:graphicFrameLocks noChangeAspect="1"/>
+          </wp:cNvGraphicFramePr>
+          <a:graphic>
+            <a:graphicData uri="http://schemas.openxmlformats.org/drawingml/2006/picture">
+              <pic:pic>
+                <pic:nvPicPr>
+                  <pic:cNvPr id="0" name="PGEX_logo_pruhledne.png"/>
+                  <pic:cNvPicPr/>
+                </pic:nvPicPr>
+                <pic:blipFill>
+                  <a:blip r:embed="rId1"/>
+                  <a:stretch>
+                    <a:fillRect/>
+                  </a:stretch>
+                </pic:blipFill>
+                <pic:spPr>
+                  <a:xfrm>
+                    <a:off x="0" y="0"/>
+                    <a:ext cx="1475999" cy="282515"/>
+                  </a:xfrm>
+                  <a:prstGeom prst="rect"/>
+                </pic:spPr>
+              </pic:pic>
+            </a:graphicData>
+          </a:graphic>
+        </wp:inline>
+      </w:drawing>
+    </w:r>
+    <w:r>
+      <w:rPr>
+        <w:sz w:val="16"/>
+      </w:rPr>
+      <w:t xml:space="preserve">   AUTOSERVIS &amp; PNEUSERVIS</w:t>
+    </w:r>
+  </w:p>
+</w:hdr>
 </file>
 
 <file path=word/numbering.xml><?xml version="1.0" encoding="utf-8"?>

</xml_diff>